<commit_message>
chore(demo): correct the licence, the crate names and the roadmap the sample states
Co-Authored-By: Claude Opus 5 <noreply@anthropic.com>
Signed-off-by: RyujiYasukochi <ryuji.yasu@gmail.com>
</commit_message>
<xml_diff>
--- a/docs/sample.docx
+++ b/docs/sample.docx
@@ -68,7 +68,7 @@
         <w:pStyle w:val="ListBullet"/>
       </w:pPr>
       <w:r>
-        <w:t>官公庁ファイル 90 件のパース成功率 100%</w:t>
+        <w:t>ゴールデンテスト 504 ファイルのパース成功率 100%</w:t>
       </w:r>
     </w:p>
     <w:p>
@@ -92,7 +92,7 @@
         <w:pStyle w:val="ListBullet"/>
       </w:pPr>
       <w:r>
-        <w:t>WASM バイナリサイズ: 約 1.4 MB</w:t>
+        <w:t>Word / PowerPoint との一致率は毎版ブラインド 50 件で計測</w:t>
       </w:r>
     </w:p>
     <w:p/>
@@ -155,7 +155,7 @@
           </w:tcPr>
           <w:p>
             <w:r>
-              <w:t>oxi-common</w:t>
+              <w:t>oxidocs-common</w:t>
             </w:r>
           </w:p>
         </w:tc>
@@ -287,7 +287,7 @@
           </w:tcPr>
           <w:p>
             <w:r>
-              <w:t>oxi-wasm</w:t>
+              <w:t>oxidocs-wasm</w:t>
             </w:r>
           </w:p>
         </w:tc>
@@ -510,7 +510,7 @@
     </w:p>
     <w:p>
       <w:r>
-        <w:t>現在 v1 (基盤) フェーズが完了し、v2 (コラボレーション) に向けて開発中です。</w:t>
+        <w:t>ブラウザ版とデスクトップ版 (Windows / macOS / Linux) を配布しています。</w:t>
       </w:r>
     </w:p>
     <w:p>
@@ -518,7 +518,7 @@
         <w:pStyle w:val="ListBullet"/>
       </w:pPr>
       <w:r>
-        <w:t>v1 (現在): OOXML パース/レンダリング/編集, PDF, 判子</w:t>
+        <w:t>出荷済み: OOXML パース/レンダリング/編集, PDF, 判子, 数式エンジン, VBA</w:t>
       </w:r>
     </w:p>
     <w:p>
@@ -526,7 +526,7 @@
         <w:pStyle w:val="ListBullet"/>
       </w:pPr>
       <w:r>
-        <w:t>v2: CRDT リアルタイム共同編集, AI アシスト, E2E 暗号化</w:t>
+        <w:t>出荷済み: デスクトップアプリ (Tauri), VS Code 拡張, CLI</w:t>
       </w:r>
     </w:p>
     <w:p>
@@ -534,7 +534,7 @@
         <w:pStyle w:val="ListBullet"/>
       </w:pPr>
       <w:r>
-        <w:t>v3: プラグインシステム, デスクトップ/モバイルアプリ (Tauri)</w:t>
+        <w:t>進行中: レイアウト一致率の底上げ (Word 実測との画素比較)</w:t>
       </w:r>
     </w:p>
     <w:p>
@@ -542,7 +542,7 @@
         <w:pStyle w:val="ListBullet"/>
       </w:pPr>
       <w:r>
-        <w:t>v4: エンタープライズ — コンプライアンス, 業界特化</w:t>
+        <w:t>検討中: リアルタイム共同編集, プラグイン</w:t>
       </w:r>
     </w:p>
     <w:p/>
@@ -556,7 +556,7 @@
     </w:p>
     <w:p>
       <w:r>
-        <w:t>MIT License — すべてのソースコードはオープンソースで提供されます。サードパーティクレートはすべて MIT 互換ライセンスです。</w:t>
+        <w:t>エンジン本体は MPL-2.0、バインディングは MIT または Apache-2.0 です。依存クレートはすべて MPL-2.0 互換ライセンスに限っています。</w:t>
       </w:r>
     </w:p>
     <w:p/>

</xml_diff>